<commit_message>
Clear the cover of the header rule and lift the logo off it
The Header style carries a bottom border, and the template declared a
first-page footer but no first-page header, so the cover page drew that rule on
its own. The base now ships an empty first-page header with the border turned
off. On the pages that do show the header, the logo is anchored at the
paragraph top and sat across the same rule; it is lifted a quarter inch clear.

Both fixes live in scripts/build_base_from_corporate.py, which regenerates
templates/vertowave_base.docx from the corporate file, so a reissued template
can be taken in with one command instead of hand surgery.

Co-Authored-By: Claude Opus 5 <noreply@anthropic.com>
</commit_message>
<xml_diff>
--- a/templates/vertowave_base.docx
+++ b/templates/vertowave_base.docx
@@ -873,6 +873,7 @@
       </w:r>
     </w:p>
     <w:sectPr>
+      <w:headerReference w:type="first" r:id="rIdFirstHeader"/>
       <w:headerReference w:type="default" r:id="rId22"/>
       <w:footerReference w:type="default" r:id="rId23"/>
       <w:footerReference w:type="first" r:id="rId24"/>
@@ -1157,7 +1158,7 @@
             <wp:posOffset>0</wp:posOffset>
           </wp:positionH>
           <wp:positionV relativeFrom="paragraph">
-            <wp:posOffset>-635</wp:posOffset>
+            <wp:posOffset>-228600</wp:posOffset>
           </wp:positionV>
           <wp:extent cx="1440814" cy="414516"/>
           <wp:effectExtent l="0" t="0" r="7620" b="5080"/>
@@ -1242,6 +1243,19 @@
       </w:rPr>
       <w:t xml:space="preserve">Technical Proposal </w:t>
     </w:r>
+  </w:p>
+</w:hdr>
+</file>
+
+<file path=word/headerFirst.xml><?xml version="1.0" encoding="utf-8"?>
+<w:hdr xmlns:w="http://schemas.openxmlformats.org/wordprocessingml/2006/main">
+  <w:p>
+    <w:pPr>
+      <w:pStyle w:val="Header"/>
+      <w:pBdr>
+        <w:bottom w:val="none" w:sz="0" w:space="0" w:color="auto"/>
+      </w:pBdr>
+    </w:pPr>
   </w:p>
 </w:hdr>
 </file>

</xml_diff>